<commit_message>
docs: evidencias de la infraestructura de MLflow
Plantilla de evidencias de la entrega 2 con las capturas de la instancia EC2, el servicio systemd, el servidor corriendo y la comparacion de corridas.
</commit_message>
<xml_diff>
--- a/docs/evidencias_entrega2.docx
+++ b/docs/evidencias_entrega2.docx
@@ -120,8 +120,8 @@
         </w:tblCellMar>
       </w:tblPr>
       <w:tblGrid>
-        <w:gridCol w:w="3398"/>
-        <w:gridCol w:w="5962"/>
+        <w:gridCol w:w="3395"/>
+        <w:gridCol w:w="5965"/>
       </w:tblGrid>
       <w:tr>
         <w:trPr>
@@ -129,7 +129,7 @@
         </w:trPr>
         <w:tc>
           <w:tcPr>
-            <w:tcW w:w="3398" w:type="dxa"/>
+            <w:tcW w:w="3395" w:type="dxa"/>
             <w:tcBorders>
               <w:top w:val="single" w:sz="4" w:space="0" w:color="000000"/>
               <w:start w:val="single" w:sz="4" w:space="0" w:color="000000"/>
@@ -159,7 +159,7 @@
         </w:tc>
         <w:tc>
           <w:tcPr>
-            <w:tcW w:w="5962" w:type="dxa"/>
+            <w:tcW w:w="5965" w:type="dxa"/>
             <w:tcBorders>
               <w:top w:val="single" w:sz="4" w:space="0" w:color="000000"/>
               <w:start w:val="single" w:sz="4" w:space="0" w:color="000000"/>
@@ -192,7 +192,7 @@
         <w:trPr/>
         <w:tc>
           <w:tcPr>
-            <w:tcW w:w="3398" w:type="dxa"/>
+            <w:tcW w:w="3395" w:type="dxa"/>
             <w:tcBorders>
               <w:top w:val="single" w:sz="4" w:space="0" w:color="000000"/>
               <w:start w:val="single" w:sz="4" w:space="0" w:color="000000"/>
@@ -222,7 +222,7 @@
         </w:tc>
         <w:tc>
           <w:tcPr>
-            <w:tcW w:w="5962" w:type="dxa"/>
+            <w:tcW w:w="5965" w:type="dxa"/>
             <w:tcBorders>
               <w:top w:val="single" w:sz="4" w:space="0" w:color="000000"/>
               <w:start w:val="single" w:sz="4" w:space="0" w:color="000000"/>
@@ -255,7 +255,7 @@
         <w:trPr/>
         <w:tc>
           <w:tcPr>
-            <w:tcW w:w="3398" w:type="dxa"/>
+            <w:tcW w:w="3395" w:type="dxa"/>
             <w:tcBorders>
               <w:top w:val="single" w:sz="4" w:space="0" w:color="000000"/>
               <w:start w:val="single" w:sz="4" w:space="0" w:color="000000"/>
@@ -285,7 +285,7 @@
         </w:tc>
         <w:tc>
           <w:tcPr>
-            <w:tcW w:w="5962" w:type="dxa"/>
+            <w:tcW w:w="5965" w:type="dxa"/>
             <w:tcBorders>
               <w:top w:val="single" w:sz="4" w:space="0" w:color="000000"/>
               <w:start w:val="single" w:sz="4" w:space="0" w:color="000000"/>
@@ -318,7 +318,7 @@
         <w:trPr/>
         <w:tc>
           <w:tcPr>
-            <w:tcW w:w="3398" w:type="dxa"/>
+            <w:tcW w:w="3395" w:type="dxa"/>
             <w:tcBorders>
               <w:top w:val="single" w:sz="4" w:space="0" w:color="000000"/>
               <w:start w:val="single" w:sz="4" w:space="0" w:color="000000"/>
@@ -348,7 +348,7 @@
         </w:tc>
         <w:tc>
           <w:tcPr>
-            <w:tcW w:w="5962" w:type="dxa"/>
+            <w:tcW w:w="5965" w:type="dxa"/>
             <w:tcBorders>
               <w:top w:val="single" w:sz="4" w:space="0" w:color="000000"/>
               <w:start w:val="single" w:sz="4" w:space="0" w:color="000000"/>
@@ -381,7 +381,7 @@
         <w:trPr/>
         <w:tc>
           <w:tcPr>
-            <w:tcW w:w="3398" w:type="dxa"/>
+            <w:tcW w:w="3395" w:type="dxa"/>
             <w:tcBorders>
               <w:top w:val="single" w:sz="4" w:space="0" w:color="000000"/>
               <w:start w:val="single" w:sz="4" w:space="0" w:color="000000"/>
@@ -411,7 +411,7 @@
         </w:tc>
         <w:tc>
           <w:tcPr>
-            <w:tcW w:w="5962" w:type="dxa"/>
+            <w:tcW w:w="5965" w:type="dxa"/>
             <w:tcBorders>
               <w:top w:val="single" w:sz="4" w:space="0" w:color="000000"/>
               <w:start w:val="single" w:sz="4" w:space="0" w:color="000000"/>
@@ -444,7 +444,7 @@
         <w:trPr/>
         <w:tc>
           <w:tcPr>
-            <w:tcW w:w="3398" w:type="dxa"/>
+            <w:tcW w:w="3395" w:type="dxa"/>
             <w:tcBorders>
               <w:top w:val="single" w:sz="4" w:space="0" w:color="000000"/>
               <w:start w:val="single" w:sz="4" w:space="0" w:color="000000"/>
@@ -474,7 +474,7 @@
         </w:tc>
         <w:tc>
           <w:tcPr>
-            <w:tcW w:w="5962" w:type="dxa"/>
+            <w:tcW w:w="5965" w:type="dxa"/>
             <w:tcBorders>
               <w:top w:val="single" w:sz="4" w:space="0" w:color="000000"/>
               <w:start w:val="single" w:sz="4" w:space="0" w:color="000000"/>
@@ -507,7 +507,7 @@
         <w:trPr/>
         <w:tc>
           <w:tcPr>
-            <w:tcW w:w="3398" w:type="dxa"/>
+            <w:tcW w:w="3395" w:type="dxa"/>
             <w:tcBorders>
               <w:top w:val="single" w:sz="4" w:space="0" w:color="000000"/>
               <w:start w:val="single" w:sz="4" w:space="0" w:color="000000"/>
@@ -537,7 +537,7 @@
         </w:tc>
         <w:tc>
           <w:tcPr>
-            <w:tcW w:w="5962" w:type="dxa"/>
+            <w:tcW w:w="5965" w:type="dxa"/>
             <w:tcBorders>
               <w:top w:val="single" w:sz="4" w:space="0" w:color="000000"/>
               <w:start w:val="single" w:sz="4" w:space="0" w:color="000000"/>
@@ -570,7 +570,7 @@
         <w:trPr/>
         <w:tc>
           <w:tcPr>
-            <w:tcW w:w="3398" w:type="dxa"/>
+            <w:tcW w:w="3395" w:type="dxa"/>
             <w:tcBorders>
               <w:top w:val="single" w:sz="4" w:space="0" w:color="000000"/>
               <w:start w:val="single" w:sz="4" w:space="0" w:color="000000"/>
@@ -600,7 +600,7 @@
         </w:tc>
         <w:tc>
           <w:tcPr>
-            <w:tcW w:w="5962" w:type="dxa"/>
+            <w:tcW w:w="5965" w:type="dxa"/>
             <w:tcBorders>
               <w:top w:val="single" w:sz="4" w:space="0" w:color="000000"/>
               <w:start w:val="single" w:sz="4" w:space="0" w:color="000000"/>
@@ -633,7 +633,7 @@
         <w:trPr/>
         <w:tc>
           <w:tcPr>
-            <w:tcW w:w="3398" w:type="dxa"/>
+            <w:tcW w:w="3395" w:type="dxa"/>
             <w:tcBorders>
               <w:top w:val="single" w:sz="4" w:space="0" w:color="000000"/>
               <w:start w:val="single" w:sz="4" w:space="0" w:color="000000"/>
@@ -663,7 +663,7 @@
         </w:tc>
         <w:tc>
           <w:tcPr>
-            <w:tcW w:w="5962" w:type="dxa"/>
+            <w:tcW w:w="5965" w:type="dxa"/>
             <w:tcBorders>
               <w:top w:val="single" w:sz="4" w:space="0" w:color="000000"/>
               <w:start w:val="single" w:sz="4" w:space="0" w:color="000000"/>
@@ -696,7 +696,7 @@
         <w:trPr/>
         <w:tc>
           <w:tcPr>
-            <w:tcW w:w="3398" w:type="dxa"/>
+            <w:tcW w:w="3395" w:type="dxa"/>
             <w:tcBorders>
               <w:top w:val="single" w:sz="4" w:space="0" w:color="000000"/>
               <w:start w:val="single" w:sz="4" w:space="0" w:color="000000"/>
@@ -726,7 +726,7 @@
         </w:tc>
         <w:tc>
           <w:tcPr>
-            <w:tcW w:w="5962" w:type="dxa"/>
+            <w:tcW w:w="5965" w:type="dxa"/>
             <w:tcBorders>
               <w:top w:val="single" w:sz="4" w:space="0" w:color="000000"/>
               <w:start w:val="single" w:sz="4" w:space="0" w:color="000000"/>
@@ -759,7 +759,7 @@
         <w:trPr/>
         <w:tc>
           <w:tcPr>
-            <w:tcW w:w="3398" w:type="dxa"/>
+            <w:tcW w:w="3395" w:type="dxa"/>
             <w:tcBorders>
               <w:top w:val="single" w:sz="4" w:space="0" w:color="000000"/>
               <w:start w:val="single" w:sz="4" w:space="0" w:color="000000"/>
@@ -789,7 +789,7 @@
         </w:tc>
         <w:tc>
           <w:tcPr>
-            <w:tcW w:w="5962" w:type="dxa"/>
+            <w:tcW w:w="5965" w:type="dxa"/>
             <w:tcBorders>
               <w:top w:val="single" w:sz="4" w:space="0" w:color="000000"/>
               <w:start w:val="single" w:sz="4" w:space="0" w:color="000000"/>
@@ -822,7 +822,7 @@
         <w:trPr/>
         <w:tc>
           <w:tcPr>
-            <w:tcW w:w="3398" w:type="dxa"/>
+            <w:tcW w:w="3395" w:type="dxa"/>
             <w:tcBorders>
               <w:top w:val="single" w:sz="4" w:space="0" w:color="000000"/>
               <w:start w:val="single" w:sz="4" w:space="0" w:color="000000"/>
@@ -852,7 +852,7 @@
         </w:tc>
         <w:tc>
           <w:tcPr>
-            <w:tcW w:w="5962" w:type="dxa"/>
+            <w:tcW w:w="5965" w:type="dxa"/>
             <w:tcBorders>
               <w:top w:val="single" w:sz="4" w:space="0" w:color="000000"/>
               <w:start w:val="single" w:sz="4" w:space="0" w:color="000000"/>
@@ -885,7 +885,7 @@
         <w:trPr/>
         <w:tc>
           <w:tcPr>
-            <w:tcW w:w="3398" w:type="dxa"/>
+            <w:tcW w:w="3395" w:type="dxa"/>
             <w:tcBorders>
               <w:top w:val="single" w:sz="4" w:space="0" w:color="000000"/>
               <w:start w:val="single" w:sz="4" w:space="0" w:color="000000"/>
@@ -915,7 +915,7 @@
         </w:tc>
         <w:tc>
           <w:tcPr>
-            <w:tcW w:w="5962" w:type="dxa"/>
+            <w:tcW w:w="5965" w:type="dxa"/>
             <w:tcBorders>
               <w:top w:val="single" w:sz="4" w:space="0" w:color="000000"/>
               <w:start w:val="single" w:sz="4" w:space="0" w:color="000000"/>
@@ -948,7 +948,7 @@
         <w:trPr/>
         <w:tc>
           <w:tcPr>
-            <w:tcW w:w="3398" w:type="dxa"/>
+            <w:tcW w:w="3395" w:type="dxa"/>
             <w:tcBorders>
               <w:top w:val="single" w:sz="4" w:space="0" w:color="000000"/>
               <w:start w:val="single" w:sz="4" w:space="0" w:color="000000"/>
@@ -978,7 +978,7 @@
         </w:tc>
         <w:tc>
           <w:tcPr>
-            <w:tcW w:w="5962" w:type="dxa"/>
+            <w:tcW w:w="5965" w:type="dxa"/>
             <w:tcBorders>
               <w:top w:val="single" w:sz="4" w:space="0" w:color="000000"/>
               <w:start w:val="single" w:sz="4" w:space="0" w:color="000000"/>
@@ -1011,7 +1011,7 @@
         <w:trPr/>
         <w:tc>
           <w:tcPr>
-            <w:tcW w:w="3398" w:type="dxa"/>
+            <w:tcW w:w="3395" w:type="dxa"/>
             <w:tcBorders>
               <w:top w:val="single" w:sz="4" w:space="0" w:color="000000"/>
               <w:start w:val="single" w:sz="4" w:space="0" w:color="000000"/>
@@ -1041,7 +1041,7 @@
         </w:tc>
         <w:tc>
           <w:tcPr>
-            <w:tcW w:w="5962" w:type="dxa"/>
+            <w:tcW w:w="5965" w:type="dxa"/>
             <w:tcBorders>
               <w:top w:val="single" w:sz="4" w:space="0" w:color="000000"/>
               <w:start w:val="single" w:sz="4" w:space="0" w:color="000000"/>
@@ -1074,7 +1074,7 @@
         <w:trPr/>
         <w:tc>
           <w:tcPr>
-            <w:tcW w:w="3398" w:type="dxa"/>
+            <w:tcW w:w="3395" w:type="dxa"/>
             <w:tcBorders>
               <w:top w:val="single" w:sz="4" w:space="0" w:color="000000"/>
               <w:start w:val="single" w:sz="4" w:space="0" w:color="000000"/>
@@ -1104,7 +1104,7 @@
         </w:tc>
         <w:tc>
           <w:tcPr>
-            <w:tcW w:w="5962" w:type="dxa"/>
+            <w:tcW w:w="5965" w:type="dxa"/>
             <w:tcBorders>
               <w:top w:val="single" w:sz="4" w:space="0" w:color="000000"/>
               <w:start w:val="single" w:sz="4" w:space="0" w:color="000000"/>
@@ -1137,7 +1137,7 @@
         <w:trPr/>
         <w:tc>
           <w:tcPr>
-            <w:tcW w:w="3398" w:type="dxa"/>
+            <w:tcW w:w="3395" w:type="dxa"/>
             <w:tcBorders>
               <w:top w:val="single" w:sz="4" w:space="0" w:color="000000"/>
               <w:start w:val="single" w:sz="4" w:space="0" w:color="000000"/>
@@ -1167,7 +1167,7 @@
         </w:tc>
         <w:tc>
           <w:tcPr>
-            <w:tcW w:w="5962" w:type="dxa"/>
+            <w:tcW w:w="5965" w:type="dxa"/>
             <w:tcBorders>
               <w:top w:val="single" w:sz="4" w:space="0" w:color="000000"/>
               <w:start w:val="single" w:sz="4" w:space="0" w:color="000000"/>
@@ -1655,7 +1655,7 @@
                 <w:szCs w:val="18"/>
               </w:rPr>
               <w:drawing>
-                <wp:anchor distT="0" distB="0" distL="0" distR="0" simplePos="0" relativeHeight="5" behindDoc="0" locked="0" layoutInCell="0" allowOverlap="1">
+                <wp:anchor distT="0" distB="0" distL="0" distR="0" simplePos="0" relativeHeight="5" behindDoc="0" locked="0" layoutInCell="1" allowOverlap="1">
                   <wp:simplePos x="0" y="0"/>
                   <wp:positionH relativeFrom="column">
                     <wp:align>center</wp:align>
@@ -2091,18 +2091,70 @@
               <w:pStyle w:val="Normal"/>
               <w:spacing w:before="1000" w:after="1000"/>
               <w:jc w:val="center"/>
-              <w:rPr/>
-            </w:pPr>
-            <w:r>
-              <w:rPr>
-                <w:rFonts w:eastAsia="Calibri" w:cs="Calibri" w:ascii="Calibri" w:hAnsi="Calibri"/>
+              <w:rPr>
+                <w:rFonts w:ascii="Calibri" w:hAnsi="Calibri" w:eastAsia="Calibri" w:cs="Calibri"/>
                 <w:i/>
                 <w:iCs/>
                 <w:color w:val="A6A6A6"/>
                 <w:sz w:val="18"/>
                 <w:szCs w:val="18"/>
               </w:rPr>
-              <w:t>pegar captura aqui</w:t>
+            </w:pPr>
+            <w:r>
+              <w:rPr>
+                <w:rFonts w:eastAsia="Calibri" w:cs="Calibri" w:ascii="Calibri" w:hAnsi="Calibri"/>
+                <w:i/>
+                <w:iCs/>
+                <w:color w:val="A6A6A6"/>
+                <w:sz w:val="18"/>
+                <w:szCs w:val="18"/>
+              </w:rPr>
+              <w:drawing>
+                <wp:anchor distT="0" distB="0" distL="0" distR="0" simplePos="0" relativeHeight="6" behindDoc="0" locked="0" layoutInCell="1" allowOverlap="1">
+                  <wp:simplePos x="0" y="0"/>
+                  <wp:positionH relativeFrom="column">
+                    <wp:align>center</wp:align>
+                  </wp:positionH>
+                  <wp:positionV relativeFrom="paragraph">
+                    <wp:posOffset>635</wp:posOffset>
+                  </wp:positionV>
+                  <wp:extent cx="5806440" cy="3268345"/>
+                  <wp:effectExtent l="0" t="0" r="0" b="0"/>
+                  <wp:wrapSquare wrapText="largest"/>
+                  <wp:docPr id="5" name="Image5"/>
+                  <wp:cNvGraphicFramePr>
+                    <a:graphicFrameLocks xmlns:a="http://schemas.openxmlformats.org/drawingml/2006/main" noChangeAspect="1"/>
+                  </wp:cNvGraphicFramePr>
+                  <a:graphic xmlns:a="http://schemas.openxmlformats.org/drawingml/2006/main">
+                    <a:graphicData uri="http://schemas.openxmlformats.org/drawingml/2006/picture">
+                      <pic:pic xmlns:pic="http://schemas.openxmlformats.org/drawingml/2006/picture">
+                        <pic:nvPicPr>
+                          <pic:cNvPr id="5" name="Image5"/>
+                          <pic:cNvPicPr>
+                            <a:picLocks noChangeAspect="1" noChangeArrowheads="1"/>
+                          </pic:cNvPicPr>
+                        </pic:nvPicPr>
+                        <pic:blipFill>
+                          <a:blip r:embed="rId6"/>
+                          <a:stretch>
+                            <a:fillRect/>
+                          </a:stretch>
+                        </pic:blipFill>
+                        <pic:spPr bwMode="auto">
+                          <a:xfrm>
+                            <a:off x="0" y="0"/>
+                            <a:ext cx="5806440" cy="3268345"/>
+                          </a:xfrm>
+                          <a:prstGeom prst="rect">
+                            <a:avLst/>
+                          </a:prstGeom>
+                          <a:noFill/>
+                        </pic:spPr>
+                      </pic:pic>
+                    </a:graphicData>
+                  </a:graphic>
+                </wp:anchor>
+              </w:drawing>
             </w:r>
           </w:p>
         </w:tc>
@@ -2198,18 +2250,70 @@
               <w:pStyle w:val="Normal"/>
               <w:spacing w:before="1000" w:after="1000"/>
               <w:jc w:val="center"/>
-              <w:rPr/>
-            </w:pPr>
-            <w:r>
-              <w:rPr>
-                <w:rFonts w:eastAsia="Calibri" w:cs="Calibri" w:ascii="Calibri" w:hAnsi="Calibri"/>
+              <w:rPr>
+                <w:rFonts w:ascii="Calibri" w:hAnsi="Calibri" w:eastAsia="Calibri" w:cs="Calibri"/>
                 <w:i/>
                 <w:iCs/>
                 <w:color w:val="A6A6A6"/>
                 <w:sz w:val="18"/>
                 <w:szCs w:val="18"/>
               </w:rPr>
-              <w:t>pegar captura aqui</w:t>
+            </w:pPr>
+            <w:r>
+              <w:rPr>
+                <w:rFonts w:eastAsia="Calibri" w:cs="Calibri" w:ascii="Calibri" w:hAnsi="Calibri"/>
+                <w:i/>
+                <w:iCs/>
+                <w:color w:val="A6A6A6"/>
+                <w:sz w:val="18"/>
+                <w:szCs w:val="18"/>
+              </w:rPr>
+              <w:drawing>
+                <wp:anchor distT="0" distB="0" distL="0" distR="0" simplePos="0" relativeHeight="9" behindDoc="0" locked="0" layoutInCell="0" allowOverlap="1">
+                  <wp:simplePos x="0" y="0"/>
+                  <wp:positionH relativeFrom="column">
+                    <wp:align>center</wp:align>
+                  </wp:positionH>
+                  <wp:positionV relativeFrom="paragraph">
+                    <wp:posOffset>635</wp:posOffset>
+                  </wp:positionV>
+                  <wp:extent cx="5806440" cy="3121025"/>
+                  <wp:effectExtent l="0" t="0" r="0" b="0"/>
+                  <wp:wrapSquare wrapText="largest"/>
+                  <wp:docPr id="6" name="Image6"/>
+                  <wp:cNvGraphicFramePr>
+                    <a:graphicFrameLocks xmlns:a="http://schemas.openxmlformats.org/drawingml/2006/main" noChangeAspect="1"/>
+                  </wp:cNvGraphicFramePr>
+                  <a:graphic xmlns:a="http://schemas.openxmlformats.org/drawingml/2006/main">
+                    <a:graphicData uri="http://schemas.openxmlformats.org/drawingml/2006/picture">
+                      <pic:pic xmlns:pic="http://schemas.openxmlformats.org/drawingml/2006/picture">
+                        <pic:nvPicPr>
+                          <pic:cNvPr id="6" name="Image6"/>
+                          <pic:cNvPicPr>
+                            <a:picLocks noChangeAspect="1" noChangeArrowheads="1"/>
+                          </pic:cNvPicPr>
+                        </pic:nvPicPr>
+                        <pic:blipFill>
+                          <a:blip r:embed="rId7"/>
+                          <a:stretch>
+                            <a:fillRect/>
+                          </a:stretch>
+                        </pic:blipFill>
+                        <pic:spPr bwMode="auto">
+                          <a:xfrm>
+                            <a:off x="0" y="0"/>
+                            <a:ext cx="5806440" cy="3121025"/>
+                          </a:xfrm>
+                          <a:prstGeom prst="rect">
+                            <a:avLst/>
+                          </a:prstGeom>
+                          <a:noFill/>
+                        </pic:spPr>
+                      </pic:pic>
+                    </a:graphicData>
+                  </a:graphic>
+                </wp:anchor>
+              </w:drawing>
             </w:r>
           </w:p>
         </w:tc>
@@ -2305,18 +2409,187 @@
               <w:pStyle w:val="Normal"/>
               <w:spacing w:before="1000" w:after="1000"/>
               <w:jc w:val="center"/>
-              <w:rPr/>
-            </w:pPr>
-            <w:r>
-              <w:rPr>
-                <w:rFonts w:eastAsia="Calibri" w:cs="Calibri" w:ascii="Calibri" w:hAnsi="Calibri"/>
+              <w:rPr>
+                <w:rFonts w:ascii="Calibri" w:hAnsi="Calibri" w:eastAsia="Calibri" w:cs="Calibri"/>
                 <w:i/>
                 <w:iCs/>
                 <w:color w:val="A6A6A6"/>
                 <w:sz w:val="18"/>
                 <w:szCs w:val="18"/>
               </w:rPr>
-              <w:t>pegar captura aqui</w:t>
+            </w:pPr>
+            <w:r>
+              <w:rPr>
+                <w:rFonts w:eastAsia="Calibri" w:cs="Calibri" w:ascii="Calibri" w:hAnsi="Calibri"/>
+                <w:i/>
+                <w:iCs/>
+                <w:color w:val="A6A6A6"/>
+                <w:sz w:val="18"/>
+                <w:szCs w:val="18"/>
+              </w:rPr>
+            </w:r>
+          </w:p>
+          <w:p>
+            <w:pPr>
+              <w:pStyle w:val="Normal"/>
+              <w:spacing w:before="1000" w:after="1000"/>
+              <w:jc w:val="center"/>
+              <w:rPr>
+                <w:rFonts w:ascii="Calibri" w:hAnsi="Calibri" w:eastAsia="Calibri" w:cs="Calibri"/>
+                <w:i/>
+                <w:iCs/>
+                <w:color w:val="A6A6A6"/>
+                <w:sz w:val="18"/>
+                <w:szCs w:val="18"/>
+              </w:rPr>
+            </w:pPr>
+            <w:r>
+              <w:rPr>
+                <w:rFonts w:eastAsia="Calibri" w:cs="Calibri" w:ascii="Calibri" w:hAnsi="Calibri"/>
+                <w:i/>
+                <w:iCs/>
+                <w:color w:val="A6A6A6"/>
+                <w:sz w:val="18"/>
+                <w:szCs w:val="18"/>
+              </w:rPr>
+              <w:drawing>
+                <wp:anchor distT="0" distB="0" distL="0" distR="0" simplePos="0" relativeHeight="7" behindDoc="0" locked="0" layoutInCell="1" allowOverlap="1">
+                  <wp:simplePos x="0" y="0"/>
+                  <wp:positionH relativeFrom="column">
+                    <wp:align>center</wp:align>
+                  </wp:positionH>
+                  <wp:positionV relativeFrom="paragraph">
+                    <wp:posOffset>635</wp:posOffset>
+                  </wp:positionV>
+                  <wp:extent cx="5806440" cy="1981200"/>
+                  <wp:effectExtent l="0" t="0" r="0" b="0"/>
+                  <wp:wrapSquare wrapText="largest"/>
+                  <wp:docPr id="7" name="Image9"/>
+                  <wp:cNvGraphicFramePr>
+                    <a:graphicFrameLocks xmlns:a="http://schemas.openxmlformats.org/drawingml/2006/main" noChangeAspect="1"/>
+                  </wp:cNvGraphicFramePr>
+                  <a:graphic xmlns:a="http://schemas.openxmlformats.org/drawingml/2006/main">
+                    <a:graphicData uri="http://schemas.openxmlformats.org/drawingml/2006/picture">
+                      <pic:pic xmlns:pic="http://schemas.openxmlformats.org/drawingml/2006/picture">
+                        <pic:nvPicPr>
+                          <pic:cNvPr id="7" name="Image9"/>
+                          <pic:cNvPicPr>
+                            <a:picLocks noChangeAspect="1" noChangeArrowheads="1"/>
+                          </pic:cNvPicPr>
+                        </pic:nvPicPr>
+                        <pic:blipFill>
+                          <a:blip r:embed="rId8"/>
+                          <a:stretch>
+                            <a:fillRect/>
+                          </a:stretch>
+                        </pic:blipFill>
+                        <pic:spPr bwMode="auto">
+                          <a:xfrm>
+                            <a:off x="0" y="0"/>
+                            <a:ext cx="5806440" cy="1981200"/>
+                          </a:xfrm>
+                          <a:prstGeom prst="rect">
+                            <a:avLst/>
+                          </a:prstGeom>
+                          <a:noFill/>
+                        </pic:spPr>
+                      </pic:pic>
+                    </a:graphicData>
+                  </a:graphic>
+                </wp:anchor>
+              </w:drawing>
+              <w:drawing>
+                <wp:anchor distT="0" distB="0" distL="0" distR="0" simplePos="0" relativeHeight="10" behindDoc="0" locked="0" layoutInCell="1" allowOverlap="1">
+                  <wp:simplePos x="0" y="0"/>
+                  <wp:positionH relativeFrom="column">
+                    <wp:align>center</wp:align>
+                  </wp:positionH>
+                  <wp:positionV relativeFrom="paragraph">
+                    <wp:posOffset>635</wp:posOffset>
+                  </wp:positionV>
+                  <wp:extent cx="5806440" cy="1981200"/>
+                  <wp:effectExtent l="0" t="0" r="0" b="0"/>
+                  <wp:wrapSquare wrapText="largest"/>
+                  <wp:docPr id="8" name="Image8"/>
+                  <wp:cNvGraphicFramePr>
+                    <a:graphicFrameLocks xmlns:a="http://schemas.openxmlformats.org/drawingml/2006/main" noChangeAspect="1"/>
+                  </wp:cNvGraphicFramePr>
+                  <a:graphic xmlns:a="http://schemas.openxmlformats.org/drawingml/2006/main">
+                    <a:graphicData uri="http://schemas.openxmlformats.org/drawingml/2006/picture">
+                      <pic:pic xmlns:pic="http://schemas.openxmlformats.org/drawingml/2006/picture">
+                        <pic:nvPicPr>
+                          <pic:cNvPr id="8" name="Image8"/>
+                          <pic:cNvPicPr>
+                            <a:picLocks noChangeAspect="1" noChangeArrowheads="1"/>
+                          </pic:cNvPicPr>
+                        </pic:nvPicPr>
+                        <pic:blipFill>
+                          <a:blip r:embed="rId9"/>
+                          <a:stretch>
+                            <a:fillRect/>
+                          </a:stretch>
+                        </pic:blipFill>
+                        <pic:spPr bwMode="auto">
+                          <a:xfrm>
+                            <a:off x="0" y="0"/>
+                            <a:ext cx="5806440" cy="1981200"/>
+                          </a:xfrm>
+                          <a:prstGeom prst="rect">
+                            <a:avLst/>
+                          </a:prstGeom>
+                          <a:noFill/>
+                        </pic:spPr>
+                      </pic:pic>
+                    </a:graphicData>
+                  </a:graphic>
+                </wp:anchor>
+              </w:drawing>
+              <w:drawing>
+                <wp:anchor distT="0" distB="0" distL="0" distR="0" simplePos="0" relativeHeight="11" behindDoc="0" locked="0" layoutInCell="1" allowOverlap="1">
+                  <wp:simplePos x="0" y="0"/>
+                  <wp:positionH relativeFrom="column">
+                    <wp:align>center</wp:align>
+                  </wp:positionH>
+                  <wp:positionV relativeFrom="paragraph">
+                    <wp:posOffset>635</wp:posOffset>
+                  </wp:positionV>
+                  <wp:extent cx="5806440" cy="3173095"/>
+                  <wp:effectExtent l="0" t="0" r="0" b="0"/>
+                  <wp:wrapSquare wrapText="largest"/>
+                  <wp:docPr id="9" name="Image7"/>
+                  <wp:cNvGraphicFramePr>
+                    <a:graphicFrameLocks xmlns:a="http://schemas.openxmlformats.org/drawingml/2006/main" noChangeAspect="1"/>
+                  </wp:cNvGraphicFramePr>
+                  <a:graphic xmlns:a="http://schemas.openxmlformats.org/drawingml/2006/main">
+                    <a:graphicData uri="http://schemas.openxmlformats.org/drawingml/2006/picture">
+                      <pic:pic xmlns:pic="http://schemas.openxmlformats.org/drawingml/2006/picture">
+                        <pic:nvPicPr>
+                          <pic:cNvPr id="9" name="Image7"/>
+                          <pic:cNvPicPr>
+                            <a:picLocks noChangeAspect="1" noChangeArrowheads="1"/>
+                          </pic:cNvPicPr>
+                        </pic:nvPicPr>
+                        <pic:blipFill>
+                          <a:blip r:embed="rId10"/>
+                          <a:stretch>
+                            <a:fillRect/>
+                          </a:stretch>
+                        </pic:blipFill>
+                        <pic:spPr bwMode="auto">
+                          <a:xfrm>
+                            <a:off x="0" y="0"/>
+                            <a:ext cx="5806440" cy="3173095"/>
+                          </a:xfrm>
+                          <a:prstGeom prst="rect">
+                            <a:avLst/>
+                          </a:prstGeom>
+                          <a:noFill/>
+                        </pic:spPr>
+                      </pic:pic>
+                    </a:graphicData>
+                  </a:graphic>
+                </wp:anchor>
+              </w:drawing>
             </w:r>
           </w:p>
         </w:tc>
@@ -2327,7 +2600,75 @@
         <w:pStyle w:val="Normal"/>
         <w:spacing w:before="80" w:after="240"/>
         <w:jc w:val="center"/>
-        <w:rPr/>
+        <w:rPr>
+          <w:rFonts w:ascii="Calibri" w:hAnsi="Calibri" w:eastAsia="Calibri" w:cs="Calibri"/>
+          <w:color w:val="767171"/>
+          <w:sz w:val="18"/>
+          <w:szCs w:val="18"/>
+        </w:rPr>
+      </w:pPr>
+      <w:r>
+        <w:rPr>
+          <w:rFonts w:eastAsia="Calibri" w:cs="Calibri" w:ascii="Calibri" w:hAnsi="Calibri"/>
+          <w:color w:val="767171"/>
+          <w:sz w:val="18"/>
+          <w:szCs w:val="18"/>
+        </w:rPr>
+      </w:r>
+    </w:p>
+    <w:p>
+      <w:pPr>
+        <w:pStyle w:val="Normal"/>
+        <w:spacing w:before="80" w:after="240"/>
+        <w:jc w:val="center"/>
+        <w:rPr>
+          <w:rFonts w:ascii="Calibri" w:hAnsi="Calibri" w:eastAsia="Calibri" w:cs="Calibri"/>
+          <w:color w:val="767171"/>
+          <w:sz w:val="18"/>
+          <w:szCs w:val="18"/>
+        </w:rPr>
+      </w:pPr>
+      <w:r>
+        <w:rPr>
+          <w:rFonts w:eastAsia="Calibri" w:cs="Calibri" w:ascii="Calibri" w:hAnsi="Calibri"/>
+          <w:color w:val="767171"/>
+          <w:sz w:val="18"/>
+          <w:szCs w:val="18"/>
+        </w:rPr>
+      </w:r>
+    </w:p>
+    <w:p>
+      <w:pPr>
+        <w:pStyle w:val="Normal"/>
+        <w:spacing w:before="80" w:after="240"/>
+        <w:jc w:val="center"/>
+        <w:rPr>
+          <w:rFonts w:ascii="Calibri" w:hAnsi="Calibri" w:eastAsia="Calibri" w:cs="Calibri"/>
+          <w:color w:val="767171"/>
+          <w:sz w:val="18"/>
+          <w:szCs w:val="18"/>
+        </w:rPr>
+      </w:pPr>
+      <w:r>
+        <w:rPr>
+          <w:rFonts w:eastAsia="Calibri" w:cs="Calibri" w:ascii="Calibri" w:hAnsi="Calibri"/>
+          <w:color w:val="767171"/>
+          <w:sz w:val="18"/>
+          <w:szCs w:val="18"/>
+        </w:rPr>
+      </w:r>
+    </w:p>
+    <w:p>
+      <w:pPr>
+        <w:pStyle w:val="Normal"/>
+        <w:spacing w:before="80" w:after="240"/>
+        <w:jc w:val="center"/>
+        <w:rPr>
+          <w:rFonts w:ascii="Calibri" w:hAnsi="Calibri" w:eastAsia="Calibri" w:cs="Calibri"/>
+          <w:color w:val="767171"/>
+          <w:sz w:val="18"/>
+          <w:szCs w:val="18"/>
+        </w:rPr>
       </w:pPr>
       <w:r>
         <w:rPr>
@@ -2412,18 +2753,70 @@
               <w:pStyle w:val="Normal"/>
               <w:spacing w:before="1000" w:after="1000"/>
               <w:jc w:val="center"/>
-              <w:rPr/>
-            </w:pPr>
-            <w:r>
-              <w:rPr>
-                <w:rFonts w:eastAsia="Calibri" w:cs="Calibri" w:ascii="Calibri" w:hAnsi="Calibri"/>
+              <w:rPr>
+                <w:rFonts w:ascii="Calibri" w:hAnsi="Calibri" w:eastAsia="Calibri" w:cs="Calibri"/>
                 <w:i/>
                 <w:iCs/>
                 <w:color w:val="A6A6A6"/>
                 <w:sz w:val="18"/>
                 <w:szCs w:val="18"/>
               </w:rPr>
-              <w:t>pegar captura aqui</w:t>
+            </w:pPr>
+            <w:r>
+              <w:rPr>
+                <w:rFonts w:eastAsia="Calibri" w:cs="Calibri" w:ascii="Calibri" w:hAnsi="Calibri"/>
+                <w:i/>
+                <w:iCs/>
+                <w:color w:val="A6A6A6"/>
+                <w:sz w:val="18"/>
+                <w:szCs w:val="18"/>
+              </w:rPr>
+              <w:drawing>
+                <wp:anchor distT="0" distB="0" distL="0" distR="0" simplePos="0" relativeHeight="8" behindDoc="0" locked="0" layoutInCell="1" allowOverlap="1">
+                  <wp:simplePos x="0" y="0"/>
+                  <wp:positionH relativeFrom="column">
+                    <wp:align>center</wp:align>
+                  </wp:positionH>
+                  <wp:positionV relativeFrom="paragraph">
+                    <wp:posOffset>635</wp:posOffset>
+                  </wp:positionV>
+                  <wp:extent cx="5806440" cy="3291205"/>
+                  <wp:effectExtent l="0" t="0" r="0" b="0"/>
+                  <wp:wrapSquare wrapText="largest"/>
+                  <wp:docPr id="10" name="Image11"/>
+                  <wp:cNvGraphicFramePr>
+                    <a:graphicFrameLocks xmlns:a="http://schemas.openxmlformats.org/drawingml/2006/main" noChangeAspect="1"/>
+                  </wp:cNvGraphicFramePr>
+                  <a:graphic xmlns:a="http://schemas.openxmlformats.org/drawingml/2006/main">
+                    <a:graphicData uri="http://schemas.openxmlformats.org/drawingml/2006/picture">
+                      <pic:pic xmlns:pic="http://schemas.openxmlformats.org/drawingml/2006/picture">
+                        <pic:nvPicPr>
+                          <pic:cNvPr id="10" name="Image11"/>
+                          <pic:cNvPicPr>
+                            <a:picLocks noChangeAspect="1" noChangeArrowheads="1"/>
+                          </pic:cNvPicPr>
+                        </pic:nvPicPr>
+                        <pic:blipFill>
+                          <a:blip r:embed="rId11"/>
+                          <a:stretch>
+                            <a:fillRect/>
+                          </a:stretch>
+                        </pic:blipFill>
+                        <pic:spPr bwMode="auto">
+                          <a:xfrm>
+                            <a:off x="0" y="0"/>
+                            <a:ext cx="5806440" cy="3291205"/>
+                          </a:xfrm>
+                          <a:prstGeom prst="rect">
+                            <a:avLst/>
+                          </a:prstGeom>
+                          <a:noFill/>
+                        </pic:spPr>
+                      </pic:pic>
+                    </a:graphicData>
+                  </a:graphic>
+                </wp:anchor>
+              </w:drawing>
             </w:r>
           </w:p>
         </w:tc>
@@ -3697,8 +4090,8 @@
         </w:tblCellMar>
       </w:tblPr>
       <w:tblGrid>
-        <w:gridCol w:w="5398"/>
-        <w:gridCol w:w="1602"/>
+        <w:gridCol w:w="5396"/>
+        <w:gridCol w:w="1604"/>
         <w:gridCol w:w="2360"/>
       </w:tblGrid>
       <w:tr>
@@ -3707,7 +4100,7 @@
         </w:trPr>
         <w:tc>
           <w:tcPr>
-            <w:tcW w:w="5398" w:type="dxa"/>
+            <w:tcW w:w="5396" w:type="dxa"/>
             <w:tcBorders>
               <w:top w:val="single" w:sz="4" w:space="0" w:color="000000"/>
               <w:start w:val="single" w:sz="4" w:space="0" w:color="000000"/>
@@ -3737,7 +4130,7 @@
         </w:tc>
         <w:tc>
           <w:tcPr>
-            <w:tcW w:w="1602" w:type="dxa"/>
+            <w:tcW w:w="1604" w:type="dxa"/>
             <w:tcBorders>
               <w:top w:val="single" w:sz="4" w:space="0" w:color="000000"/>
               <w:start w:val="single" w:sz="4" w:space="0" w:color="000000"/>
@@ -3800,7 +4193,7 @@
         <w:trPr/>
         <w:tc>
           <w:tcPr>
-            <w:tcW w:w="5398" w:type="dxa"/>
+            <w:tcW w:w="5396" w:type="dxa"/>
             <w:tcBorders>
               <w:top w:val="single" w:sz="4" w:space="0" w:color="000000"/>
               <w:start w:val="single" w:sz="4" w:space="0" w:color="000000"/>
@@ -3830,7 +4223,7 @@
         </w:tc>
         <w:tc>
           <w:tcPr>
-            <w:tcW w:w="1602" w:type="dxa"/>
+            <w:tcW w:w="1604" w:type="dxa"/>
             <w:tcBorders>
               <w:top w:val="single" w:sz="4" w:space="0" w:color="000000"/>
               <w:start w:val="single" w:sz="4" w:space="0" w:color="000000"/>
@@ -3885,7 +4278,7 @@
         <w:trPr/>
         <w:tc>
           <w:tcPr>
-            <w:tcW w:w="5398" w:type="dxa"/>
+            <w:tcW w:w="5396" w:type="dxa"/>
             <w:tcBorders>
               <w:top w:val="single" w:sz="4" w:space="0" w:color="000000"/>
               <w:start w:val="single" w:sz="4" w:space="0" w:color="000000"/>
@@ -3915,7 +4308,7 @@
         </w:tc>
         <w:tc>
           <w:tcPr>
-            <w:tcW w:w="1602" w:type="dxa"/>
+            <w:tcW w:w="1604" w:type="dxa"/>
             <w:tcBorders>
               <w:top w:val="single" w:sz="4" w:space="0" w:color="000000"/>
               <w:start w:val="single" w:sz="4" w:space="0" w:color="000000"/>
@@ -3970,7 +4363,7 @@
         <w:trPr/>
         <w:tc>
           <w:tcPr>
-            <w:tcW w:w="5398" w:type="dxa"/>
+            <w:tcW w:w="5396" w:type="dxa"/>
             <w:tcBorders>
               <w:top w:val="single" w:sz="4" w:space="0" w:color="000000"/>
               <w:start w:val="single" w:sz="4" w:space="0" w:color="000000"/>
@@ -4000,7 +4393,7 @@
         </w:tc>
         <w:tc>
           <w:tcPr>
-            <w:tcW w:w="1602" w:type="dxa"/>
+            <w:tcW w:w="1604" w:type="dxa"/>
             <w:tcBorders>
               <w:top w:val="single" w:sz="4" w:space="0" w:color="000000"/>
               <w:start w:val="single" w:sz="4" w:space="0" w:color="000000"/>
@@ -4055,7 +4448,7 @@
         <w:trPr/>
         <w:tc>
           <w:tcPr>
-            <w:tcW w:w="5398" w:type="dxa"/>
+            <w:tcW w:w="5396" w:type="dxa"/>
             <w:tcBorders>
               <w:top w:val="single" w:sz="4" w:space="0" w:color="000000"/>
               <w:start w:val="single" w:sz="4" w:space="0" w:color="000000"/>
@@ -4085,7 +4478,7 @@
         </w:tc>
         <w:tc>
           <w:tcPr>
-            <w:tcW w:w="1602" w:type="dxa"/>
+            <w:tcW w:w="1604" w:type="dxa"/>
             <w:tcBorders>
               <w:top w:val="single" w:sz="4" w:space="0" w:color="000000"/>
               <w:start w:val="single" w:sz="4" w:space="0" w:color="000000"/>
@@ -4140,7 +4533,7 @@
         <w:trPr/>
         <w:tc>
           <w:tcPr>
-            <w:tcW w:w="5398" w:type="dxa"/>
+            <w:tcW w:w="5396" w:type="dxa"/>
             <w:tcBorders>
               <w:top w:val="single" w:sz="4" w:space="0" w:color="000000"/>
               <w:start w:val="single" w:sz="4" w:space="0" w:color="000000"/>
@@ -4170,7 +4563,7 @@
         </w:tc>
         <w:tc>
           <w:tcPr>
-            <w:tcW w:w="1602" w:type="dxa"/>
+            <w:tcW w:w="1604" w:type="dxa"/>
             <w:tcBorders>
               <w:top w:val="single" w:sz="4" w:space="0" w:color="000000"/>
               <w:start w:val="single" w:sz="4" w:space="0" w:color="000000"/>
@@ -4225,7 +4618,7 @@
         <w:trPr/>
         <w:tc>
           <w:tcPr>
-            <w:tcW w:w="5398" w:type="dxa"/>
+            <w:tcW w:w="5396" w:type="dxa"/>
             <w:tcBorders>
               <w:top w:val="single" w:sz="4" w:space="0" w:color="000000"/>
               <w:start w:val="single" w:sz="4" w:space="0" w:color="000000"/>
@@ -4255,7 +4648,7 @@
         </w:tc>
         <w:tc>
           <w:tcPr>
-            <w:tcW w:w="1602" w:type="dxa"/>
+            <w:tcW w:w="1604" w:type="dxa"/>
             <w:tcBorders>
               <w:top w:val="single" w:sz="4" w:space="0" w:color="000000"/>
               <w:start w:val="single" w:sz="4" w:space="0" w:color="000000"/>
@@ -4310,7 +4703,7 @@
         <w:trPr/>
         <w:tc>
           <w:tcPr>
-            <w:tcW w:w="5398" w:type="dxa"/>
+            <w:tcW w:w="5396" w:type="dxa"/>
             <w:tcBorders>
               <w:top w:val="single" w:sz="4" w:space="0" w:color="000000"/>
               <w:start w:val="single" w:sz="4" w:space="0" w:color="000000"/>
@@ -4340,7 +4733,7 @@
         </w:tc>
         <w:tc>
           <w:tcPr>
-            <w:tcW w:w="1602" w:type="dxa"/>
+            <w:tcW w:w="1604" w:type="dxa"/>
             <w:tcBorders>
               <w:top w:val="single" w:sz="4" w:space="0" w:color="000000"/>
               <w:start w:val="single" w:sz="4" w:space="0" w:color="000000"/>
@@ -4395,7 +4788,7 @@
         <w:trPr/>
         <w:tc>
           <w:tcPr>
-            <w:tcW w:w="5398" w:type="dxa"/>
+            <w:tcW w:w="5396" w:type="dxa"/>
             <w:tcBorders>
               <w:top w:val="single" w:sz="4" w:space="0" w:color="000000"/>
               <w:start w:val="single" w:sz="4" w:space="0" w:color="000000"/>
@@ -4425,7 +4818,7 @@
         </w:tc>
         <w:tc>
           <w:tcPr>
-            <w:tcW w:w="1602" w:type="dxa"/>
+            <w:tcW w:w="1604" w:type="dxa"/>
             <w:tcBorders>
               <w:top w:val="single" w:sz="4" w:space="0" w:color="000000"/>
               <w:start w:val="single" w:sz="4" w:space="0" w:color="000000"/>
@@ -4613,8 +5006,8 @@
       <w:u w:val="single"/>
     </w:rPr>
   </w:style>
-  <w:style w:type="character" w:styleId="FootnoteCharactersuser">
-    <w:name w:val="Footnote Characters (user)"/>
+  <w:style w:type="character" w:styleId="FootnoteCharacters">
+    <w:name w:val="Footnote Characters"/>
     <w:uiPriority w:val="99"/>
     <w:semiHidden/>
     <w:unhideWhenUsed/>
@@ -4623,8 +5016,8 @@
       <w:vertAlign w:val="superscript"/>
     </w:rPr>
   </w:style>
-  <w:style w:type="character" w:styleId="FootnoteCharacters">
-    <w:name w:val="Footnote Characters"/>
+  <w:style w:type="character" w:styleId="FootnoteCharactersuser">
+    <w:name w:val="Footnote Characters (user)"/>
     <w:qFormat/>
     <w:rPr>
       <w:vertAlign w:val="superscript"/>
@@ -4648,8 +5041,8 @@
       <w:szCs w:val="20"/>
     </w:rPr>
   </w:style>
-  <w:style w:type="character" w:styleId="EndnoteCharactersuser">
-    <w:name w:val="Endnote Characters (user)"/>
+  <w:style w:type="character" w:styleId="EndnoteCharacters">
+    <w:name w:val="Endnote Characters"/>
     <w:uiPriority w:val="99"/>
     <w:semiHidden/>
     <w:unhideWhenUsed/>
@@ -4658,8 +5051,8 @@
       <w:vertAlign w:val="superscript"/>
     </w:rPr>
   </w:style>
-  <w:style w:type="character" w:styleId="EndnoteCharacters">
-    <w:name w:val="Endnote Characters"/>
+  <w:style w:type="character" w:styleId="EndnoteCharactersuser">
+    <w:name w:val="Endnote Characters (user)"/>
     <w:qFormat/>
     <w:rPr>
       <w:vertAlign w:val="superscript"/>

</xml_diff>